<commit_message>
Updated documentation for v1.0.1
</commit_message>
<xml_diff>
--- a/Documents/RT24 Configuration Release Notes.docx
+++ b/Documents/RT24 Configuration Release Notes.docx
@@ -165,7 +165,7 @@
             </w:rPr>
             <w:fldChar w:fldCharType="separate"/>
           </w:r>
-          <w:hyperlink w:anchor="_Toc52908762" w:history="1">
+          <w:hyperlink w:anchor="_Toc52911605" w:history="1">
             <w:r>
               <w:rPr>
                 <w:rStyle w:val="Hyperlink"/>
@@ -192,7 +192,83 @@
                 <w:noProof/>
                 <w:webHidden/>
               </w:rPr>
-              <w:instrText xml:space="preserve"> PAGEREF _Toc52908762 \h </w:instrText>
+              <w:instrText xml:space="preserve"> PAGEREF _Toc52911605 \h </w:instrText>
+            </w:r>
+            <w:r>
+              <w:rPr>
+                <w:noProof/>
+                <w:webHidden/>
+              </w:rPr>
+            </w:r>
+            <w:r>
+              <w:rPr>
+                <w:noProof/>
+                <w:webHidden/>
+              </w:rPr>
+              <w:fldChar w:fldCharType="separate"/>
+            </w:r>
+            <w:r>
+              <w:rPr>
+                <w:noProof/>
+                <w:webHidden/>
+              </w:rPr>
+              <w:t>3</w:t>
+            </w:r>
+            <w:r>
+              <w:rPr>
+                <w:noProof/>
+                <w:webHidden/>
+              </w:rPr>
+              <w:fldChar w:fldCharType="end"/>
+            </w:r>
+          </w:hyperlink>
+        </w:p>
+        <w:p>
+          <w:pPr>
+            <w:pStyle w:val="TOC1"/>
+            <w:tabs>
+              <w:tab w:val="right" w:leader="dot" w:pos="10450"/>
+            </w:tabs>
+            <w:rPr>
+              <w:rFonts w:eastAsiaTheme="minorEastAsia"/>
+              <w:b w:val="0"/>
+              <w:bCs w:val="0"/>
+              <w:i w:val="0"/>
+              <w:iCs w:val="0"/>
+              <w:noProof/>
+              <w:sz w:val="22"/>
+              <w:szCs w:val="22"/>
+              <w:lang w:eastAsia="en-GB"/>
+            </w:rPr>
+          </w:pPr>
+          <w:hyperlink w:anchor="_Toc52911606" w:history="1">
+            <w:r>
+              <w:rPr>
+                <w:rStyle w:val="Hyperlink"/>
+                <w:noProof/>
+              </w:rPr>
+              <w:t>Version v1.0.1</w:t>
+            </w:r>
+            <w:r>
+              <w:rPr>
+                <w:noProof/>
+                <w:webHidden/>
+              </w:rPr>
+              <w:tab/>
+            </w:r>
+            <w:r>
+              <w:rPr>
+                <w:noProof/>
+                <w:webHidden/>
+              </w:rPr>
+              <w:fldChar w:fldCharType="begin"/>
+            </w:r>
+            <w:r>
+              <w:rPr>
+                <w:noProof/>
+                <w:webHidden/>
+              </w:rPr>
+              <w:instrText xml:space="preserve"> PAGEREF _Toc52911606 \h </w:instrText>
             </w:r>
             <w:r>
               <w:rPr>
@@ -251,7 +327,7 @@
       <w:pPr>
         <w:pStyle w:val="Heading1"/>
       </w:pPr>
-      <w:bookmarkStart w:id="0" w:name="_Toc52908762"/>
+      <w:bookmarkStart w:id="0" w:name="_Toc52911605"/>
       <w:r>
         <w:lastRenderedPageBreak/>
         <w:t xml:space="preserve">Version </w:t>
@@ -473,13 +549,232 @@
               <w:t xml:space="preserve">See </w:t>
             </w:r>
             <w:r>
+              <w:t xml:space="preserve">RT24 </w:t>
+            </w:r>
+            <w:r>
+              <w:t>Radio Configuration Table.xlsx for frequencies and configurations.</w:t>
+            </w:r>
+          </w:p>
+        </w:tc>
+      </w:tr>
+    </w:tbl>
+    <w:p/>
+    <w:p>
+      <w:pPr>
+        <w:pStyle w:val="Heading1"/>
+      </w:pPr>
+      <w:bookmarkStart w:id="1" w:name="_Toc52911606"/>
+      <w:r>
+        <w:t>Version v1.0.1</w:t>
+      </w:r>
+      <w:bookmarkEnd w:id="1"/>
+    </w:p>
+    <w:tbl>
+      <w:tblPr>
+        <w:tblStyle w:val="TableGrid"/>
+        <w:tblW w:w="10485" w:type="dxa"/>
+        <w:tblLook w:val="04A0" w:firstRow="1" w:lastRow="0" w:firstColumn="1" w:lastColumn="0" w:noHBand="0" w:noVBand="1"/>
+      </w:tblPr>
+      <w:tblGrid>
+        <w:gridCol w:w="2074"/>
+        <w:gridCol w:w="8411"/>
+      </w:tblGrid>
+      <w:tr>
+        <w:tc>
+          <w:tcPr>
+            <w:tcW w:w="2074" w:type="dxa"/>
+          </w:tcPr>
+          <w:p>
+            <w:pPr>
+              <w:rPr>
+                <w:b/>
+                <w:bCs/>
+              </w:rPr>
+            </w:pPr>
+            <w:r>
+              <w:rPr>
+                <w:b/>
+                <w:bCs/>
+              </w:rPr>
+              <w:t>Version</w:t>
+            </w:r>
+          </w:p>
+        </w:tc>
+        <w:tc>
+          <w:tcPr>
+            <w:tcW w:w="8411" w:type="dxa"/>
+          </w:tcPr>
+          <w:p>
+            <w:r>
+              <w:t>v1.0.</w:t>
+            </w:r>
+            <w:r>
+              <w:t>1</w:t>
+            </w:r>
+          </w:p>
+        </w:tc>
+      </w:tr>
+      <w:tr>
+        <w:tc>
+          <w:tcPr>
+            <w:tcW w:w="2074" w:type="dxa"/>
+          </w:tcPr>
+          <w:p>
+            <w:pPr>
+              <w:rPr>
+                <w:b/>
+                <w:bCs/>
+              </w:rPr>
+            </w:pPr>
+            <w:r>
+              <w:rPr>
+                <w:b/>
+                <w:bCs/>
+              </w:rPr>
+              <w:t>Author</w:t>
+            </w:r>
+          </w:p>
+        </w:tc>
+        <w:tc>
+          <w:tcPr>
+            <w:tcW w:w="8411" w:type="dxa"/>
+          </w:tcPr>
+          <w:p>
+            <w:r>
+              <w:t>Samuel Netherway</w:t>
+            </w:r>
+          </w:p>
+        </w:tc>
+      </w:tr>
+      <w:tr>
+        <w:tc>
+          <w:tcPr>
+            <w:tcW w:w="2074" w:type="dxa"/>
+          </w:tcPr>
+          <w:p>
+            <w:pPr>
+              <w:rPr>
+                <w:b/>
+                <w:bCs/>
+              </w:rPr>
+            </w:pPr>
+            <w:r>
+              <w:rPr>
+                <w:b/>
+                <w:bCs/>
+              </w:rPr>
+              <w:t>Release Date</w:t>
+            </w:r>
+          </w:p>
+        </w:tc>
+        <w:tc>
+          <w:tcPr>
+            <w:tcW w:w="8411" w:type="dxa"/>
+          </w:tcPr>
+          <w:p>
+            <w:r>
+              <w:t>06/10/2020</w:t>
+            </w:r>
+          </w:p>
+        </w:tc>
+      </w:tr>
+      <w:tr>
+        <w:tc>
+          <w:tcPr>
+            <w:tcW w:w="2074" w:type="dxa"/>
+          </w:tcPr>
+          <w:p>
+            <w:pPr>
+              <w:rPr>
+                <w:b/>
+                <w:bCs/>
+              </w:rPr>
+            </w:pPr>
+            <w:r>
+              <w:rPr>
+                <w:b/>
+                <w:bCs/>
+              </w:rPr>
+              <w:t>Changes</w:t>
+            </w:r>
+          </w:p>
+        </w:tc>
+        <w:tc>
+          <w:tcPr>
+            <w:tcW w:w="8411" w:type="dxa"/>
+          </w:tcPr>
+          <w:p>
+            <w:r>
+              <w:t>Channel 10 Scramble on</w:t>
+            </w:r>
+          </w:p>
+          <w:p>
+            <w:r>
+              <w:t>Channel 11 through 16 set to high power</w:t>
+            </w:r>
+          </w:p>
+        </w:tc>
+      </w:tr>
+      <w:tr>
+        <w:tc>
+          <w:tcPr>
+            <w:tcW w:w="2074" w:type="dxa"/>
+          </w:tcPr>
+          <w:p>
+            <w:pPr>
+              <w:rPr>
+                <w:b/>
+                <w:bCs/>
+              </w:rPr>
+            </w:pPr>
+            <w:r>
+              <w:rPr>
+                <w:b/>
+                <w:bCs/>
+              </w:rPr>
+              <w:t>Compatibility</w:t>
+            </w:r>
+          </w:p>
+        </w:tc>
+        <w:tc>
+          <w:tcPr>
+            <w:tcW w:w="8411" w:type="dxa"/>
+          </w:tcPr>
+          <w:p>
+            <w:r>
               <w:t>RT24</w:t>
             </w:r>
-            <w:r>
-              <w:t xml:space="preserve"> </w:t>
-            </w:r>
-            <w:r>
-              <w:t>Radio Configuration Table.xlsx for frequencies and configurations.</w:t>
+          </w:p>
+        </w:tc>
+      </w:tr>
+      <w:tr>
+        <w:tc>
+          <w:tcPr>
+            <w:tcW w:w="2074" w:type="dxa"/>
+          </w:tcPr>
+          <w:p>
+            <w:pPr>
+              <w:rPr>
+                <w:b/>
+                <w:bCs/>
+              </w:rPr>
+            </w:pPr>
+            <w:r>
+              <w:rPr>
+                <w:b/>
+                <w:bCs/>
+              </w:rPr>
+              <w:t>Important Details</w:t>
+            </w:r>
+          </w:p>
+        </w:tc>
+        <w:tc>
+          <w:tcPr>
+            <w:tcW w:w="8411" w:type="dxa"/>
+          </w:tcPr>
+          <w:p>
+            <w:r>
+              <w:t>See RT24 Radio Configuration Table.xlsx for frequencies and configurations.</w:t>
             </w:r>
           </w:p>
         </w:tc>

</xml_diff>